<commit_message>
Refresh RND editor bug report from latest retest
New pass: session still 503, PDF 15s timeout, My Files click does not
open editor. Word report includes steps, expected vs actual, screenshots.

Co-authored-by: Shafeen Noor <Shafeen-Noor@users.noreply.github.com>
</commit_message>
<xml_diff>
--- a/docs/Quillio_RND_Editor_Bug_Report.docx
+++ b/docs/Quillio_RND_Editor_Bug_Report.docx
@@ -8,7 +8,6 @@
       </w:pPr>
       <w:r>
         <w:rPr>
-          <w:rFonts w:ascii="Calibri" w:hAnsi="Calibri"/>
           <w:b/>
           <w:color w:val="1B3A5F"/>
           <w:sz w:val="44"/>
@@ -25,12 +24,12 @@
           <w:color w:val="B42318"/>
           <w:sz w:val="28"/>
         </w:rPr>
-        <w:t>Fresh editor retest — 18 August 2026 (afternoon)</w:t>
+        <w:t>Fresh editor retest — 18 August 2026 (~14:25 UTC)</w:t>
       </w:r>
     </w:p>
     <w:p>
       <w:r>
-        <w:t>This report is from a new live pass of the document editor on RND. The editor is still unusable. The default document page mounts the native Editor SDK. POST /editor/session returns HTTP 503 for documents that reach the SDK. Other documents never mount the SDK and hang on a spinner. My Files on the dashboard now shows an empty “create a folder” state even though the documents API still returns 26 files. Format-quality bugs from 17 August could not be retested because no document canvas loaded.</w:t>
+        <w:t>This report is from a new live pass of the document editor on RND (app v10.2.2). The editor remains unusable. Documents that reach the native Editor SDK fail with HTTP 503 or a 15-second client timeout. Other documents hang on a spinner and never call /editor/session. Clicking a file in My Files selects the checkbox but does not open the editor. Prior format-quality bugs from 17 August could not be retested because no document canvas loaded with content.</w:t>
       </w:r>
     </w:p>
     <w:p>
@@ -190,7 +189,7 @@
                 <w:b w:val="0"/>
                 <w:sz w:val="20"/>
               </w:rPr>
-              <w:t>POST https://api.rnd.legalassistant.au/editor/session → 503</w:t>
+              <w:t>POST https://api.rnd.legalassistant.au/editor/session → 503 (when called)</w:t>
             </w:r>
           </w:p>
         </w:tc>
@@ -330,7 +329,7 @@
                 <w:b w:val="0"/>
                 <w:sz w:val="20"/>
               </w:rPr>
-              <w:t>18 August 2026, ~14:15 UTC</w:t>
+              <w:t>18 August 2026, ~14:25 UTC</w:t>
             </w:r>
           </w:p>
         </w:tc>
@@ -365,7 +364,7 @@
                 <w:b w:val="0"/>
                 <w:sz w:val="20"/>
               </w:rPr>
-              <w:t>7 Aug, 12 Aug, 17 Aug, 18 Aug morning</w:t>
+              <w:t>7 Aug, 12 Aug, 17 Aug, 18 Aug morning &amp; afternoon</w:t>
             </w:r>
           </w:p>
         </w:tc>
@@ -400,7 +399,7 @@
                 <w:b w:val="0"/>
                 <w:sz w:val="20"/>
               </w:rPr>
-              <w:t>Open/edit DOC, DOCX, PDF, TXT, CSV, XLSX, MP3, invalid id, dashboard file list</w:t>
+              <w:t>Open CSV, XLSX, PDF, DOCX, DOC, TXT, MP3, invalid id; My Files; File/Import/Share</w:t>
             </w:r>
           </w:p>
         </w:tc>
@@ -423,7 +422,7 @@
         <w:pStyle w:val="ListBullet"/>
       </w:pPr>
       <w:r>
-        <w:t>Critical: editor session API is down (HTTP 503). Header Failed to load. Canvas shows the 503 text.</w:t>
+        <w:t>Critical: editor session still returns 503 for CSV and XLSX. Header Failed to load.</w:t>
       </w:r>
     </w:p>
     <w:p>
@@ -431,7 +430,7 @@
         <w:pStyle w:val="ListBullet"/>
       </w:pPr>
       <w:r>
-        <w:t>Critical: no tested format opened. CSV / XLSX / PDF show 503. DOCX / TXT / legacy DOC / MP3 hang on a spinner. Some URLs never call /editor/session.</w:t>
+        <w:t>Critical: PDF now fails with “timeout of 15000ms exceeded” (new message this pass) after ~30s.</w:t>
       </w:r>
     </w:p>
     <w:p>
@@ -439,7 +438,7 @@
         <w:pStyle w:val="ListBullet"/>
       </w:pPr>
       <w:r>
-        <w:t>High: My Files is empty (“Let’s create new folder to get started”) while GET /documents returns 26 files. Users cannot browse to documents from the dashboard.</w:t>
+        <w:t>Critical: DOCX / DOC / TXT / MP3 hang — spinner or blank canvas; often no /editor/session call.</w:t>
       </w:r>
     </w:p>
     <w:p>
@@ -447,7 +446,7 @@
         <w:pStyle w:val="ListBullet"/>
       </w:pPr>
       <w:r>
-        <w:t>High: File / Import / Share in the editor header cannot be clicked (layout overlay intercepts pointer events).</w:t>
+        <w:t>High: File / Import / Share on the failed editor page are not clickable (overlay intercepts clicks).</w:t>
       </w:r>
     </w:p>
     <w:p>
@@ -455,7 +454,7 @@
         <w:pStyle w:val="ListBullet"/>
       </w:pPr>
       <w:r>
-        <w:t>High: failure UX is inconsistent — 503 vs spinner-with-chrome vs full-page spinner with no chrome.</w:t>
+        <w:t>High: Clicking a document name in My Files only checks the checkbox; it does not navigate to /d/{id}.</w:t>
       </w:r>
     </w:p>
     <w:p>
@@ -463,7 +462,7 @@
         <w:pStyle w:val="ListBullet"/>
       </w:pPr>
       <w:r>
-        <w:t>Medium: missing document id spins ~16–25 seconds, then Unable to Load Document. Tab title is undefined | Quillio.</w:t>
+        <w:t>Medium: Invalid document id spins 25–35s before Unable to Load Document; tab title is undefined | Quillio.</w:t>
       </w:r>
     </w:p>
     <w:p>
@@ -471,7 +470,7 @@
         <w:pStyle w:val="ListBullet"/>
       </w:pPr>
       <w:r>
-        <w:t>Medium: HTTPS /auth/login (no slash) 301-redirects to http://.</w:t>
+        <w:t>Medium: HTTPS /auth/login (no slash) still 301-redirects to http://.</w:t>
       </w:r>
     </w:p>
     <w:p>
@@ -479,7 +478,15 @@
         <w:pStyle w:val="ListBullet"/>
       </w:pPr>
       <w:r>
-        <w:t>Blocked: 17 August format bugs (DOC upgrade, CSV hashes, XLSX Sheet1-only, PNG placeholder, typing delay, no Insert, PPT missing) could not be retested.</w:t>
+        <w:t>Note: My Files listed documents on this pass (earlier afternoon pass showed an empty create-folder state — intermittent).</w:t>
+      </w:r>
+    </w:p>
+    <w:p>
+      <w:pPr>
+        <w:pStyle w:val="ListBullet"/>
+      </w:pPr>
+      <w:r>
+        <w:t>Blocked: 17 August format bugs could not be retested (canvas never showed content).</w:t>
       </w:r>
     </w:p>
     <w:p>
@@ -720,7 +727,7 @@
                 <w:b w:val="0"/>
                 <w:sz w:val="18"/>
               </w:rPr>
-              <w:t>All tested formats fail to open (503 or hang)</w:t>
+              <w:t>All tested formats fail to open (503, timeout, or hang)</w:t>
             </w:r>
           </w:p>
         </w:tc>
@@ -745,7 +752,7 @@
         <w:tc>
           <w:tcPr>
             <w:tcW w:type="dxa" w:w="2550"/>
-            <w:shd w:fill="FCE8D5" w:val="clear"/>
+            <w:shd w:fill="F8D7DA" w:val="clear"/>
           </w:tcPr>
           <w:p>
             <w:r/>
@@ -755,7 +762,7 @@
                 <w:b w:val="0"/>
                 <w:sz w:val="18"/>
               </w:rPr>
-              <w:t>High</w:t>
+              <w:t>Critical</w:t>
             </w:r>
           </w:p>
         </w:tc>
@@ -771,7 +778,7 @@
                 <w:b w:val="0"/>
                 <w:sz w:val="18"/>
               </w:rPr>
-              <w:t>Still failing</w:t>
+              <w:t>New this pass</w:t>
             </w:r>
           </w:p>
         </w:tc>
@@ -787,7 +794,7 @@
                 <w:b w:val="0"/>
                 <w:sz w:val="18"/>
               </w:rPr>
-              <w:t>Inconsistent failure UX: 503 vs spinner vs blank page</w:t>
+              <w:t>PDF fails with “timeout of 15000ms exceeded”</w:t>
             </w:r>
           </w:p>
         </w:tc>
@@ -854,7 +861,7 @@
                 <w:b w:val="0"/>
                 <w:sz w:val="18"/>
               </w:rPr>
-              <w:t>File / Import / Share unclickable — overlay intercepts clicks</w:t>
+              <w:t>Inconsistent failure UX: 503 vs timeout vs spinner</w:t>
             </w:r>
           </w:p>
         </w:tc>
@@ -905,7 +912,7 @@
                 <w:b w:val="0"/>
                 <w:sz w:val="18"/>
               </w:rPr>
-              <w:t>New this pass</w:t>
+              <w:t>Still failing</w:t>
             </w:r>
           </w:p>
         </w:tc>
@@ -921,7 +928,7 @@
                 <w:b w:val="0"/>
                 <w:sz w:val="18"/>
               </w:rPr>
-              <w:t>My Files empty despite 26 documents from the API</w:t>
+              <w:t>File / Import / Share unclickable — overlay intercepts clicks</w:t>
             </w:r>
           </w:p>
         </w:tc>
@@ -946,7 +953,7 @@
         <w:tc>
           <w:tcPr>
             <w:tcW w:type="dxa" w:w="2550"/>
-            <w:shd w:fill="FFF3CD" w:val="clear"/>
+            <w:shd w:fill="FCE8D5" w:val="clear"/>
           </w:tcPr>
           <w:p>
             <w:r/>
@@ -956,7 +963,7 @@
                 <w:b w:val="0"/>
                 <w:sz w:val="18"/>
               </w:rPr>
-              <w:t>Medium</w:t>
+              <w:t>High</w:t>
             </w:r>
           </w:p>
         </w:tc>
@@ -972,7 +979,7 @@
                 <w:b w:val="0"/>
                 <w:sz w:val="18"/>
               </w:rPr>
-              <w:t>Still failing</w:t>
+              <w:t>New this pass</w:t>
             </w:r>
           </w:p>
         </w:tc>
@@ -988,7 +995,7 @@
                 <w:b w:val="0"/>
                 <w:sz w:val="18"/>
               </w:rPr>
-              <w:t>Missing document: long spinner, then title “undefined | Quillio”</w:t>
+              <w:t>My Files click selects checkbox but does not open editor</w:t>
             </w:r>
           </w:p>
         </w:tc>
@@ -1055,6 +1062,73 @@
                 <w:b w:val="0"/>
                 <w:sz w:val="18"/>
               </w:rPr>
+              <w:t>Missing document: long spinner; title “undefined | Quillio”</w:t>
+            </w:r>
+          </w:p>
+        </w:tc>
+      </w:tr>
+      <w:tr>
+        <w:tc>
+          <w:tcPr>
+            <w:tcW w:type="dxa" w:w="2550"/>
+          </w:tcPr>
+          <w:p>
+            <w:r/>
+            <w:r>
+              <w:rPr>
+                <w:rFonts w:ascii="Calibri" w:hAnsi="Calibri"/>
+                <w:b/>
+                <w:sz w:val="18"/>
+              </w:rPr>
+              <w:t>BUG-08</w:t>
+            </w:r>
+          </w:p>
+        </w:tc>
+        <w:tc>
+          <w:tcPr>
+            <w:tcW w:type="dxa" w:w="2550"/>
+            <w:shd w:fill="FFF3CD" w:val="clear"/>
+          </w:tcPr>
+          <w:p>
+            <w:r/>
+            <w:r>
+              <w:rPr>
+                <w:rFonts w:ascii="Calibri" w:hAnsi="Calibri"/>
+                <w:b w:val="0"/>
+                <w:sz w:val="18"/>
+              </w:rPr>
+              <w:t>Medium</w:t>
+            </w:r>
+          </w:p>
+        </w:tc>
+        <w:tc>
+          <w:tcPr>
+            <w:tcW w:type="dxa" w:w="2550"/>
+          </w:tcPr>
+          <w:p>
+            <w:r/>
+            <w:r>
+              <w:rPr>
+                <w:rFonts w:ascii="Calibri" w:hAnsi="Calibri"/>
+                <w:b w:val="0"/>
+                <w:sz w:val="18"/>
+              </w:rPr>
+              <w:t>Still failing</w:t>
+            </w:r>
+          </w:p>
+        </w:tc>
+        <w:tc>
+          <w:tcPr>
+            <w:tcW w:type="dxa" w:w="2550"/>
+          </w:tcPr>
+          <w:p>
+            <w:r/>
+            <w:r>
+              <w:rPr>
+                <w:rFonts w:ascii="Calibri" w:hAnsi="Calibri"/>
+                <w:b w:val="0"/>
+                <w:sz w:val="18"/>
+              </w:rPr>
               <w:t>Login URL without slash redirects HTTPS → HTTP</w:t>
             </w:r>
           </w:p>
@@ -1073,7 +1147,7 @@
                 <w:b/>
                 <w:sz w:val="18"/>
               </w:rPr>
-              <w:t>BUG-08</w:t>
+              <w:t>BUG-09</w:t>
             </w:r>
           </w:p>
         </w:tc>
@@ -1122,7 +1196,7 @@
                 <w:b w:val="0"/>
                 <w:sz w:val="18"/>
               </w:rPr>
-              <w:t>Home first paint stuck on “Loading files…”</w:t>
+              <w:t>Home first paint shows “Loading files…”</w:t>
             </w:r>
           </w:p>
         </w:tc>
@@ -1323,7 +1397,7 @@
                 <w:b w:val="0"/>
                 <w:sz w:val="18"/>
               </w:rPr>
-              <w:t>~2s typing delay; no Insert Link/Image/Table (17 Aug)</w:t>
+              <w:t>Typing delay; no Insert Link/Image/Table (17 Aug)</w:t>
             </w:r>
           </w:p>
         </w:tc>
@@ -1390,7 +1464,7 @@
                 <w:b w:val="0"/>
                 <w:sz w:val="18"/>
               </w:rPr>
-              <w:t>CSV ######## dates; XLSX Sheet1-only; PNG placeholder (17 Aug)</w:t>
+              <w:t>CSV ########; XLSX Sheet1-only; PNG placeholder (17 Aug)</w:t>
             </w:r>
           </w:p>
         </w:tc>
@@ -1477,7 +1551,7 @@
     </w:p>
     <w:p>
       <w:r>
-        <w:t>Each row is a live open of /d/{id} after login, waiting 16 seconds (25 seconds for the invalid id). SDK host means .quillio-doc-editor was in the DOM. Session is POST /editor/session.</w:t>
+        <w:t>Each row is a live open of /d/{id} after login. Wait was 16 seconds unless noted. SDK host means .quillio-doc-editor was in the DOM.</w:t>
       </w:r>
     </w:p>
     <w:tbl>
@@ -1552,7 +1626,7 @@
                 <w:color w:val="FFFFFF"/>
                 <w:sz w:val="18"/>
               </w:rPr>
-              <w:t>Result at 16s</w:t>
+              <w:t>Result</w:t>
             </w:r>
           </w:p>
         </w:tc>
@@ -1624,7 +1698,7 @@
                 <w:b w:val="0"/>
                 <w:sz w:val="16"/>
               </w:rPr>
-              <w:t>503 + Failed to load</w:t>
+              <w:t>503 + Failed to load (16s)</w:t>
             </w:r>
           </w:p>
         </w:tc>
@@ -1691,7 +1765,7 @@
                 <w:b w:val="0"/>
                 <w:sz w:val="16"/>
               </w:rPr>
-              <w:t>503 + Failed to load</w:t>
+              <w:t>503 + Failed to load (16s)</w:t>
             </w:r>
           </w:p>
         </w:tc>
@@ -1758,7 +1832,7 @@
                 <w:b w:val="0"/>
                 <w:sz w:val="16"/>
               </w:rPr>
-              <w:t>503 + Failed to load</w:t>
+              <w:t>Spinner at 16s; timeout 15000ms at 30s</w:t>
             </w:r>
           </w:p>
         </w:tc>
@@ -1774,7 +1848,7 @@
                 <w:b w:val="0"/>
                 <w:sz w:val="16"/>
               </w:rPr>
-              <w:t>POST 503</w:t>
+              <w:t>No call observed at 16s</w:t>
             </w:r>
           </w:p>
         </w:tc>
@@ -1825,7 +1899,7 @@
                 <w:b w:val="0"/>
                 <w:sz w:val="16"/>
               </w:rPr>
-              <w:t>Spinner / blank canvas, chrome present</w:t>
+              <w:t>Full-page spinner (16s)</w:t>
             </w:r>
           </w:p>
         </w:tc>
@@ -1892,7 +1966,7 @@
                 <w:b w:val="0"/>
                 <w:sz w:val="16"/>
               </w:rPr>
-              <w:t>Full-page spinner, no chrome</w:t>
+              <w:t>Spinner / blank chrome (16s)</w:t>
             </w:r>
           </w:p>
         </w:tc>
@@ -1959,7 +2033,7 @@
                 <w:b w:val="0"/>
                 <w:sz w:val="16"/>
               </w:rPr>
-              <w:t>Full-page spinner, no chrome</w:t>
+              <w:t>Spinner / blank chrome (16s)</w:t>
             </w:r>
           </w:p>
         </w:tc>
@@ -2026,7 +2100,7 @@
                 <w:b w:val="0"/>
                 <w:sz w:val="16"/>
               </w:rPr>
-              <w:t>Spinner / blank canvas, chrome present</w:t>
+              <w:t>Spinner / blank chrome (16s)</w:t>
             </w:r>
           </w:p>
         </w:tc>
@@ -2093,7 +2167,7 @@
                 <w:b w:val="0"/>
                 <w:sz w:val="16"/>
               </w:rPr>
-              <w:t>Spinner / blank canvas</w:t>
+              <w:t>Spinner / blank chrome (16s)</w:t>
             </w:r>
           </w:p>
         </w:tc>
@@ -2160,7 +2234,7 @@
                 <w:b w:val="0"/>
                 <w:sz w:val="16"/>
               </w:rPr>
-              <w:t>Spinner at 16s; not-found at 25s</w:t>
+              <w:t>Spinner 25s; not-found at 35s</w:t>
             </w:r>
           </w:p>
         </w:tc>
@@ -2280,7 +2354,7 @@
                 <w:b w:val="0"/>
                 <w:sz w:val="20"/>
               </w:rPr>
-              <w:t>Still failing (18 Aug 2026 afternoon)</w:t>
+              <w:t>Still failing (18 Aug 2026 ~14:25 UTC)</w:t>
             </w:r>
           </w:p>
         </w:tc>
@@ -2350,7 +2424,7 @@
                 <w:b w:val="0"/>
                 <w:sz w:val="20"/>
               </w:rPr>
-              <w:t>RND v10.2.2 — app.rnd.legalassistant.au</w:t>
+              <w:t>RND v10.2.2</w:t>
             </w:r>
           </w:p>
         </w:tc>
@@ -2361,7 +2435,7 @@
       <w:r>
         <w:t>Description</w:t>
         <w:br/>
-        <w:t>The default document route mounts the native Editor SDK, not OnlyOffice. The SDK calls POST https://api.rnd.legalassistant.au/editor/session. That call returns HTTP 503. The canvas shows “Request failed with status code 503” and the header shows “Failed to load”. No document body is rendered. Editing, review, and Amelia apply-edit flows that need a live editor are blocked.</w:t>
+        <w:t>The default document route mounts the native Editor SDK. POST https://api.rnd.legalassistant.au/editor/session returns HTTP 503 for documents that reach the SDK (confirmed on CSV and XLSX this pass). The canvas shows “Request failed with status code 503” and the header shows “Failed to load”. No document body is rendered.</w:t>
       </w:r>
     </w:p>
     <w:p>
@@ -2376,22 +2450,22 @@
     </w:p>
     <w:p>
       <w:r>
-        <w:t>1.  Log in at https://app.rnd.legalassistant.au/auth/login/ (trailing slash; see BUG-07).</w:t>
+        <w:t>1.  Log in at https://app.rnd.legalassistant.au/auth/login/ (trailing slash; see BUG-08).</w:t>
       </w:r>
     </w:p>
     <w:p>
       <w:r>
-        <w:t>2.  Open /d/6a71d6d2e436a371f0d8eff8 (QA-FORMAT CSV) or any other library document that reaches the SDK.</w:t>
+        <w:t>2.  Open /d/6a71d6d2e436a371f0d8eff8 (QA-FORMAT CSV).</w:t>
       </w:r>
     </w:p>
     <w:p>
       <w:r>
-        <w:t>3.  Wait until Loading / Preparing editor finishes.</w:t>
+        <w:t>3.  Wait until Loading / Preparing finishes.</w:t>
       </w:r>
     </w:p>
     <w:p>
       <w:r>
-        <w:t>4.  Check the canvas, the header status, and Network for editor/session.</w:t>
+        <w:t>4.  Check canvas, header, and Network for editor/session.</w:t>
       </w:r>
     </w:p>
     <w:p>
@@ -2406,7 +2480,7 @@
     </w:p>
     <w:p>
       <w:r>
-        <w:t>POST /editor/session returns 503. Canvas: Request failed with status code 503. Header: Failed to load. Only iframe is Chatwoot. .quillio-doc-editor is present.</w:t>
+        <w:t>POST /editor/session returns 503. Canvas: Request failed with status code 503. Header: Failed to load. Only iframe is Chatwoot.</w:t>
       </w:r>
     </w:p>
     <w:p>
@@ -2421,7 +2495,7 @@
     </w:p>
     <w:p>
       <w:r>
-        <w:t>POST /editor/session returns 200 with a valid session. Document content renders and can be edited and saved.</w:t>
+        <w:t>POST /editor/session returns 200 with a valid session. Document content renders and can be edited.</w:t>
       </w:r>
     </w:p>
     <w:p>
@@ -2488,6 +2562,69 @@
     </w:p>
     <w:p/>
     <w:p>
+      <w:r>
+        <w:rPr>
+          <w:b/>
+          <w:color w:val="1B3A5F"/>
+          <w:sz w:val="24"/>
+        </w:rPr>
+        <w:t>Screenshot</w:t>
+      </w:r>
+    </w:p>
+    <w:p>
+      <w:pPr>
+        <w:jc w:val="center"/>
+      </w:pPr>
+      <w:r>
+        <w:drawing>
+          <wp:inline xmlns:a="http://schemas.openxmlformats.org/drawingml/2006/main" xmlns:pic="http://schemas.openxmlformats.org/drawingml/2006/picture">
+            <wp:extent cx="5760720" cy="3600450"/>
+            <wp:docPr id="2" name="Picture 2"/>
+            <wp:cNvGraphicFramePr>
+              <a:graphicFrameLocks noChangeAspect="1"/>
+            </wp:cNvGraphicFramePr>
+            <a:graphic>
+              <a:graphicData uri="http://schemas.openxmlformats.org/drawingml/2006/picture">
+                <pic:pic>
+                  <pic:nvPicPr>
+                    <pic:cNvPr id="0" name="xlsx.png"/>
+                    <pic:cNvPicPr/>
+                  </pic:nvPicPr>
+                  <pic:blipFill>
+                    <a:blip r:embed="rId10"/>
+                    <a:stretch>
+                      <a:fillRect/>
+                    </a:stretch>
+                  </pic:blipFill>
+                  <pic:spPr>
+                    <a:xfrm>
+                      <a:off x="0" y="0"/>
+                      <a:ext cx="5760720" cy="3600450"/>
+                    </a:xfrm>
+                    <a:prstGeom prst="rect"/>
+                  </pic:spPr>
+                </pic:pic>
+              </a:graphicData>
+            </a:graphic>
+          </wp:inline>
+        </w:drawing>
+      </w:r>
+    </w:p>
+    <w:p>
+      <w:pPr>
+        <w:jc w:val="center"/>
+      </w:pPr>
+      <w:r>
+        <w:rPr>
+          <w:i/>
+          <w:color w:val="4A5568"/>
+          <w:sz w:val="18"/>
+        </w:rPr>
+        <w:t>Figure 2. QA-FORMAT XLSX — Failed to load and HTTP 503</w:t>
+      </w:r>
+    </w:p>
+    <w:p/>
+    <w:p>
       <w:pPr>
         <w:pStyle w:val="Heading2"/>
       </w:pPr>
@@ -2495,7 +2632,7 @@
         <w:rPr>
           <w:color w:val="1B3A5F"/>
         </w:rPr>
-        <w:t>BUG-02  ·  All tested formats fail to open (503 or hang)</w:t>
+        <w:t>BUG-02  ·  All tested formats fail to open (503, timeout, or hang)</w:t>
       </w:r>
     </w:p>
     <w:tbl>
@@ -2573,7 +2710,7 @@
                 <w:b w:val="0"/>
                 <w:sz w:val="20"/>
               </w:rPr>
-              <w:t>Still failing (18 Aug 2026 afternoon)</w:t>
+              <w:t>Still failing</w:t>
             </w:r>
           </w:p>
         </w:tc>
@@ -2654,7 +2791,7 @@
       <w:r>
         <w:t>Description</w:t>
         <w:br/>
-        <w:t>The outage is not limited to one type. CSV, XLSX, and PDF reach the SDK and fail with 503. Word File.docx, IAS_16.txt, and MP3 keep editor chrome but never show content. Sample Contract.docx and 354-Traders .doc never even mount chrome — full-page spinner only. No tested file showed readable content in this pass.</w:t>
+        <w:t>No tested format showed readable content. CSV and XLSX fail with 503. PDF eventually fails with a client timeout. DOCX, DOC, TXT, and MP3 hang without mounting a working editor. Some URLs never call /editor/session within 16 seconds.</w:t>
       </w:r>
     </w:p>
     <w:p>
@@ -2669,12 +2806,12 @@
     </w:p>
     <w:p>
       <w:r>
-        <w:t>1.  Open a CSV, XLSX, PDF, two different DOCX files, a TXT, a legacy DOC, and an MP3 from known ids.</w:t>
+        <w:t>1.  Open CSV, XLSX, PDF, two DOCX files, a TXT, a legacy DOC, and an MP3 via known /d/{id} URLs.</w:t>
       </w:r>
     </w:p>
     <w:p>
       <w:r>
-        <w:t>2.  Wait at least 16 seconds on each.</w:t>
+        <w:t>2.  Wait at least 16 seconds (30s for PDF).</w:t>
       </w:r>
     </w:p>
     <w:p>
@@ -2689,7 +2826,7 @@
     </w:p>
     <w:p>
       <w:r>
-        <w:t>CSV / XLSX / PDF: 503. Word File.docx / TXT / MP3: spinner with chrome, no session call. Sample Contract.docx and Traders .doc: full-page spinner.</w:t>
+        <w:t>CSV/XLSX: 503. PDF: timeout of 15000ms exceeded. DOCX/DOC/TXT/MP3: spinner or blank, no content.</w:t>
       </w:r>
     </w:p>
     <w:p>
@@ -2704,72 +2841,9 @@
     </w:p>
     <w:p>
       <w:r>
-        <w:t>Each supported format opens with readable content. Unsupported types should be rejected at Import, not hung in the editor.</w:t>
+        <w:t>Each supported format opens with readable content within a bounded wait.</w:t>
       </w:r>
     </w:p>
-    <w:p>
-      <w:r>
-        <w:rPr>
-          <w:b/>
-          <w:color w:val="1B3A5F"/>
-          <w:sz w:val="24"/>
-        </w:rPr>
-        <w:t>Screenshot</w:t>
-      </w:r>
-    </w:p>
-    <w:p>
-      <w:pPr>
-        <w:jc w:val="center"/>
-      </w:pPr>
-      <w:r>
-        <w:drawing>
-          <wp:inline xmlns:a="http://schemas.openxmlformats.org/drawingml/2006/main" xmlns:pic="http://schemas.openxmlformats.org/drawingml/2006/picture">
-            <wp:extent cx="5760720" cy="3600450"/>
-            <wp:docPr id="2" name="Picture 2"/>
-            <wp:cNvGraphicFramePr>
-              <a:graphicFrameLocks noChangeAspect="1"/>
-            </wp:cNvGraphicFramePr>
-            <a:graphic>
-              <a:graphicData uri="http://schemas.openxmlformats.org/drawingml/2006/picture">
-                <pic:pic>
-                  <pic:nvPicPr>
-                    <pic:cNvPr id="0" name="xlsx.png"/>
-                    <pic:cNvPicPr/>
-                  </pic:nvPicPr>
-                  <pic:blipFill>
-                    <a:blip r:embed="rId10"/>
-                    <a:stretch>
-                      <a:fillRect/>
-                    </a:stretch>
-                  </pic:blipFill>
-                  <pic:spPr>
-                    <a:xfrm>
-                      <a:off x="0" y="0"/>
-                      <a:ext cx="5760720" cy="3600450"/>
-                    </a:xfrm>
-                    <a:prstGeom prst="rect"/>
-                  </pic:spPr>
-                </pic:pic>
-              </a:graphicData>
-            </a:graphic>
-          </wp:inline>
-        </w:drawing>
-      </w:r>
-    </w:p>
-    <w:p>
-      <w:pPr>
-        <w:jc w:val="center"/>
-      </w:pPr>
-      <w:r>
-        <w:rPr>
-          <w:i/>
-          <w:color w:val="4A5568"/>
-          <w:sz w:val="18"/>
-        </w:rPr>
-        <w:t>Figure 2. QA-FORMAT XLSX — 503</w:t>
-      </w:r>
-    </w:p>
-    <w:p/>
     <w:p>
       <w:r>
         <w:rPr>
@@ -2796,7 +2870,7 @@
               <a:graphicData uri="http://schemas.openxmlformats.org/drawingml/2006/picture">
                 <pic:pic>
                   <pic:nvPicPr>
-                    <pic:cNvPr id="0" name="pdf.png"/>
+                    <pic:cNvPr id="0" name="docx.png"/>
                     <pic:cNvPicPr/>
                   </pic:nvPicPr>
                   <pic:blipFill>
@@ -2829,7 +2903,7 @@
           <w:color w:val="4A5568"/>
           <w:sz w:val="18"/>
         </w:rPr>
-        <w:t>Figure 3. PDF — 503</w:t>
+        <w:t>Figure 3. Word File.docx — full-page spinner</w:t>
       </w:r>
     </w:p>
     <w:p/>
@@ -2859,7 +2933,7 @@
               <a:graphicData uri="http://schemas.openxmlformats.org/drawingml/2006/picture">
                 <pic:pic>
                   <pic:nvPicPr>
-                    <pic:cNvPr id="0" name="docx.png"/>
+                    <pic:cNvPr id="0" name="doc.png"/>
                     <pic:cNvPicPr/>
                   </pic:nvPicPr>
                   <pic:blipFill>
@@ -2892,10 +2966,230 @@
           <w:color w:val="4A5568"/>
           <w:sz w:val="18"/>
         </w:rPr>
-        <w:t>Figure 4. Word File.docx — spinner, no document</w:t>
+        <w:t>Figure 4. Legacy DOC / other hang — blank or spinner, no content</w:t>
       </w:r>
     </w:p>
     <w:p/>
+    <w:p>
+      <w:pPr>
+        <w:pStyle w:val="Heading2"/>
+      </w:pPr>
+      <w:r>
+        <w:rPr>
+          <w:color w:val="1B3A5F"/>
+        </w:rPr>
+        <w:t>BUG-03  ·  PDF fails with “timeout of 15000ms exceeded”</w:t>
+      </w:r>
+    </w:p>
+    <w:tbl>
+      <w:tblPr>
+        <w:tblStyle w:val="TableGrid"/>
+        <w:tblW w:type="auto" w:w="0"/>
+        <w:tblLook w:firstColumn="1" w:firstRow="1" w:lastColumn="0" w:lastRow="0" w:noHBand="0" w:noVBand="1" w:val="04A0"/>
+      </w:tblPr>
+      <w:tblGrid>
+        <w:gridCol w:w="5100"/>
+        <w:gridCol w:w="5100"/>
+      </w:tblGrid>
+      <w:tr>
+        <w:tc>
+          <w:tcPr>
+            <w:tcW w:type="dxa" w:w="5100"/>
+            <w:shd w:fill="F4F6F9" w:val="clear"/>
+          </w:tcPr>
+          <w:p>
+            <w:r/>
+            <w:r>
+              <w:rPr>
+                <w:rFonts w:ascii="Calibri" w:hAnsi="Calibri"/>
+                <w:b/>
+                <w:sz w:val="20"/>
+              </w:rPr>
+              <w:t>Severity</w:t>
+            </w:r>
+          </w:p>
+        </w:tc>
+        <w:tc>
+          <w:tcPr>
+            <w:tcW w:type="dxa" w:w="5100"/>
+          </w:tcPr>
+          <w:p>
+            <w:r/>
+            <w:r>
+              <w:rPr>
+                <w:rFonts w:ascii="Calibri" w:hAnsi="Calibri"/>
+                <w:b w:val="0"/>
+                <w:sz w:val="20"/>
+              </w:rPr>
+              <w:t>Critical</w:t>
+            </w:r>
+          </w:p>
+        </w:tc>
+      </w:tr>
+      <w:tr>
+        <w:tc>
+          <w:tcPr>
+            <w:tcW w:type="dxa" w:w="5100"/>
+            <w:shd w:fill="F4F6F9" w:val="clear"/>
+          </w:tcPr>
+          <w:p>
+            <w:r/>
+            <w:r>
+              <w:rPr>
+                <w:rFonts w:ascii="Calibri" w:hAnsi="Calibri"/>
+                <w:b/>
+                <w:sz w:val="20"/>
+              </w:rPr>
+              <w:t>Status</w:t>
+            </w:r>
+          </w:p>
+        </w:tc>
+        <w:tc>
+          <w:tcPr>
+            <w:tcW w:type="dxa" w:w="5100"/>
+          </w:tcPr>
+          <w:p>
+            <w:r/>
+            <w:r>
+              <w:rPr>
+                <w:rFonts w:ascii="Calibri" w:hAnsi="Calibri"/>
+                <w:b w:val="0"/>
+                <w:sz w:val="20"/>
+              </w:rPr>
+              <w:t>New / newly observed this pass</w:t>
+            </w:r>
+          </w:p>
+        </w:tc>
+      </w:tr>
+      <w:tr>
+        <w:tc>
+          <w:tcPr>
+            <w:tcW w:type="dxa" w:w="5100"/>
+            <w:shd w:fill="F4F6F9" w:val="clear"/>
+          </w:tcPr>
+          <w:p>
+            <w:r/>
+            <w:r>
+              <w:rPr>
+                <w:rFonts w:ascii="Calibri" w:hAnsi="Calibri"/>
+                <w:b/>
+                <w:sz w:val="20"/>
+              </w:rPr>
+              <w:t>Area</w:t>
+            </w:r>
+          </w:p>
+        </w:tc>
+        <w:tc>
+          <w:tcPr>
+            <w:tcW w:type="dxa" w:w="5100"/>
+          </w:tcPr>
+          <w:p>
+            <w:r/>
+            <w:r>
+              <w:rPr>
+                <w:rFonts w:ascii="Calibri" w:hAnsi="Calibri"/>
+                <w:b w:val="0"/>
+                <w:sz w:val="20"/>
+              </w:rPr>
+              <w:t>Document editor / PDF</w:t>
+            </w:r>
+          </w:p>
+        </w:tc>
+      </w:tr>
+      <w:tr>
+        <w:tc>
+          <w:tcPr>
+            <w:tcW w:type="dxa" w:w="5100"/>
+            <w:shd w:fill="F4F6F9" w:val="clear"/>
+          </w:tcPr>
+          <w:p>
+            <w:r/>
+            <w:r>
+              <w:rPr>
+                <w:rFonts w:ascii="Calibri" w:hAnsi="Calibri"/>
+                <w:b/>
+                <w:sz w:val="20"/>
+              </w:rPr>
+              <w:t>Environment</w:t>
+            </w:r>
+          </w:p>
+        </w:tc>
+        <w:tc>
+          <w:tcPr>
+            <w:tcW w:type="dxa" w:w="5100"/>
+          </w:tcPr>
+          <w:p>
+            <w:r/>
+            <w:r>
+              <w:rPr>
+                <w:rFonts w:ascii="Calibri" w:hAnsi="Calibri"/>
+                <w:b w:val="0"/>
+                <w:sz w:val="20"/>
+              </w:rPr>
+              <w:t>RND v10.2.2</w:t>
+            </w:r>
+          </w:p>
+        </w:tc>
+      </w:tr>
+    </w:tbl>
+    <w:p/>
+    <w:p>
+      <w:r>
+        <w:t>Description</w:t>
+        <w:br/>
+        <w:t>Opening 2024 Annual Conference Delegates List (1).pdf shows a spinner / blank canvas at 16 seconds. After ~30 seconds the canvas shows “timeout of 15000ms exceeded” and the header shows Failed to load. Earlier today the same PDF often showed HTTP 503. The failure mode is unstable, but the PDF never opens.</w:t>
+      </w:r>
+    </w:p>
+    <w:p>
+      <w:r>
+        <w:rPr>
+          <w:b/>
+          <w:color w:val="1B3A5F"/>
+          <w:sz w:val="24"/>
+        </w:rPr>
+        <w:t>Steps to reproduce</w:t>
+      </w:r>
+    </w:p>
+    <w:p>
+      <w:r>
+        <w:t>1.  Open /d/67b05abd53d35f08452a1cea.</w:t>
+      </w:r>
+    </w:p>
+    <w:p>
+      <w:r>
+        <w:t>2.  Wait 16 seconds, then wait until ~30 seconds.</w:t>
+      </w:r>
+    </w:p>
+    <w:p>
+      <w:r>
+        <w:rPr>
+          <w:b/>
+          <w:color w:val="B42318"/>
+          <w:sz w:val="24"/>
+        </w:rPr>
+        <w:t>Actual result</w:t>
+      </w:r>
+    </w:p>
+    <w:p>
+      <w:r>
+        <w:t>16s: blank/spinner. 30s: timeout of 15000ms exceeded + Failed to load. No PDF pages.</w:t>
+      </w:r>
+    </w:p>
+    <w:p>
+      <w:r>
+        <w:rPr>
+          <w:b/>
+          <w:color w:val="1F7A4D"/>
+          <w:sz w:val="24"/>
+        </w:rPr>
+        <w:t>Expected result</w:t>
+      </w:r>
+    </w:p>
+    <w:p>
+      <w:r>
+        <w:t>PDF opens in the editor or a viewer within a reasonable time, or fails with a clear, immediate error.</w:t>
+      </w:r>
+    </w:p>
     <w:p>
       <w:r>
         <w:rPr>
@@ -2922,7 +3216,7 @@
               <a:graphicData uri="http://schemas.openxmlformats.org/drawingml/2006/picture">
                 <pic:pic>
                   <pic:nvPicPr>
-                    <pic:cNvPr id="0" name="contract.png"/>
+                    <pic:cNvPr id="0" name="pdf16.png"/>
                     <pic:cNvPicPr/>
                   </pic:nvPicPr>
                   <pic:blipFill>
@@ -2955,7 +3249,7 @@
           <w:color w:val="4A5568"/>
           <w:sz w:val="18"/>
         </w:rPr>
-        <w:t>Figure 5. Sample Contract.docx — full-page spinner</w:t>
+        <w:t>Figure 5. PDF at 16 seconds — blank canvas / spinner</w:t>
       </w:r>
     </w:p>
     <w:p/>
@@ -2985,7 +3279,7 @@
               <a:graphicData uri="http://schemas.openxmlformats.org/drawingml/2006/picture">
                 <pic:pic>
                   <pic:nvPicPr>
-                    <pic:cNvPr id="0" name="doc.png"/>
+                    <pic:cNvPr id="0" name="pdf30.png"/>
                     <pic:cNvPicPr/>
                   </pic:nvPicPr>
                   <pic:blipFill>
@@ -3018,70 +3312,7 @@
           <w:color w:val="4A5568"/>
           <w:sz w:val="18"/>
         </w:rPr>
-        <w:t>Figure 6. 354-Traders .doc — full-page spinner</w:t>
-      </w:r>
-    </w:p>
-    <w:p/>
-    <w:p>
-      <w:r>
-        <w:rPr>
-          <w:b/>
-          <w:color w:val="1B3A5F"/>
-          <w:sz w:val="24"/>
-        </w:rPr>
-        <w:t>Screenshot</w:t>
-      </w:r>
-    </w:p>
-    <w:p>
-      <w:pPr>
-        <w:jc w:val="center"/>
-      </w:pPr>
-      <w:r>
-        <w:drawing>
-          <wp:inline xmlns:a="http://schemas.openxmlformats.org/drawingml/2006/main" xmlns:pic="http://schemas.openxmlformats.org/drawingml/2006/picture">
-            <wp:extent cx="5760720" cy="3600450"/>
-            <wp:docPr id="7" name="Picture 7"/>
-            <wp:cNvGraphicFramePr>
-              <a:graphicFrameLocks noChangeAspect="1"/>
-            </wp:cNvGraphicFramePr>
-            <a:graphic>
-              <a:graphicData uri="http://schemas.openxmlformats.org/drawingml/2006/picture">
-                <pic:pic>
-                  <pic:nvPicPr>
-                    <pic:cNvPr id="0" name="txt.png"/>
-                    <pic:cNvPicPr/>
-                  </pic:nvPicPr>
-                  <pic:blipFill>
-                    <a:blip r:embed="rId15"/>
-                    <a:stretch>
-                      <a:fillRect/>
-                    </a:stretch>
-                  </pic:blipFill>
-                  <pic:spPr>
-                    <a:xfrm>
-                      <a:off x="0" y="0"/>
-                      <a:ext cx="5760720" cy="3600450"/>
-                    </a:xfrm>
-                    <a:prstGeom prst="rect"/>
-                  </pic:spPr>
-                </pic:pic>
-              </a:graphicData>
-            </a:graphic>
-          </wp:inline>
-        </w:drawing>
-      </w:r>
-    </w:p>
-    <w:p>
-      <w:pPr>
-        <w:jc w:val="center"/>
-      </w:pPr>
-      <w:r>
-        <w:rPr>
-          <w:i/>
-          <w:color w:val="4A5568"/>
-          <w:sz w:val="18"/>
-        </w:rPr>
-        <w:t>Figure 7. IAS_16.txt — spinner, no document</w:t>
+        <w:t>Figure 6. PDF at 30 seconds — timeout of 15000ms exceeded</w:t>
       </w:r>
     </w:p>
     <w:p/>
@@ -3093,7 +3324,7 @@
         <w:rPr>
           <w:color w:val="1B3A5F"/>
         </w:rPr>
-        <w:t>BUG-03  ·  Inconsistent failure UX: 503 vs spinner vs blank page</w:t>
+        <w:t>BUG-04  ·  Inconsistent failure UX: 503 vs timeout vs spinner</w:t>
       </w:r>
     </w:p>
     <w:tbl>
@@ -3252,7 +3483,7 @@
       <w:r>
         <w:t>Description</w:t>
         <w:br/>
-        <w:t>The same product failure produces three UIs: a 503 message, a spinner inside editor chrome, or a full-page spinner with no File/Import chrome. Several hangs never call /editor/session at all. Users cannot tell whether to wait, retry, or leave. There is no timeout.</w:t>
+        <w:t>The same product failure produces different UIs: HTTP 503 text, a 15s client timeout message, a spinner inside editor chrome, or a full-page spinner with no chrome. Users cannot tell whether to wait, retry, or leave. There is no consistent timeout policy.</w:t>
       </w:r>
     </w:p>
     <w:p>
@@ -3267,22 +3498,12 @@
     </w:p>
     <w:p>
       <w:r>
-        <w:t>1.  Open QA-FORMAT CSV (503).</w:t>
+        <w:t>1.  Open CSV (503), PDF (timeout), Word File.docx (full-page spinner), Sample Contract.docx (chrome + blank).</w:t>
       </w:r>
     </w:p>
     <w:p>
       <w:r>
-        <w:t>2.  Open Word File.docx (spinner with chrome).</w:t>
-      </w:r>
-    </w:p>
-    <w:p>
-      <w:r>
-        <w:t>3.  Open Sample Contract.docx or 354-Traders .doc (full-page spinner).</w:t>
-      </w:r>
-    </w:p>
-    <w:p>
-      <w:r>
-        <w:t>4.  Compare elapsed time and whether an error ever appears.</w:t>
+        <w:t>2.  Compare messages and elapsed time.</w:t>
       </w:r>
     </w:p>
     <w:p>
@@ -3297,7 +3518,7 @@
     </w:p>
     <w:p>
       <w:r>
-        <w:t>Three different failure presentations for documents that all fail to load. Some never error.</w:t>
+        <w:t>Four different failure presentations. Some never error within 16 seconds.</w:t>
       </w:r>
     </w:p>
     <w:p>
@@ -3323,7 +3544,7 @@
         <w:rPr>
           <w:color w:val="1B3A5F"/>
         </w:rPr>
-        <w:t>BUG-04  ·  File / Import / Share unclickable — overlay intercepts clicks</w:t>
+        <w:t>BUG-05  ·  File / Import / Share unclickable — overlay intercepts clicks</w:t>
       </w:r>
     </w:p>
     <w:tbl>
@@ -3482,7 +3703,7 @@
       <w:r>
         <w:t>Description</w:t>
         <w:br/>
-        <w:t>On a failed editor page, File, Import, and Share are visible but not clickable. Clicks time out because a layout overlay intercepts pointer events. Users cannot export, re-import, or share from the dead editor.</w:t>
+        <w:t>On a failed editor page (CSV 503), File, Import, and Share are visible but not clickable. Playwright click times out because a layout overlay intercepts pointer events. Users cannot recover via File or Share from the dead editor.</w:t>
       </w:r>
     </w:p>
     <w:p>
@@ -3517,7 +3738,7 @@
     </w:p>
     <w:p>
       <w:r>
-        <w:t>Clicks never open a menu or dialog. File / Import / Share remain inert.</w:t>
+        <w:t>Clicks never open a menu or dialog.</w:t>
       </w:r>
     </w:p>
     <w:p>
@@ -3532,7 +3753,7 @@
     </w:p>
     <w:p>
       <w:r>
-        <w:t>Those controls stay usable when the canvas has failed, so the user can leave or recover.</w:t>
+        <w:t>Those controls stay usable when the canvas has failed.</w:t>
       </w:r>
     </w:p>
     <w:p>
@@ -3553,7 +3774,7 @@
         <w:drawing>
           <wp:inline xmlns:a="http://schemas.openxmlformats.org/drawingml/2006/main" xmlns:pic="http://schemas.openxmlformats.org/drawingml/2006/picture">
             <wp:extent cx="5760720" cy="3600450"/>
-            <wp:docPr id="8" name="Picture 8"/>
+            <wp:docPr id="7" name="Picture 7"/>
             <wp:cNvGraphicFramePr>
               <a:graphicFrameLocks noChangeAspect="1"/>
             </wp:cNvGraphicFramePr>
@@ -3594,7 +3815,7 @@
           <w:color w:val="4A5568"/>
           <w:sz w:val="18"/>
         </w:rPr>
-        <w:t>Figure 8. File / Import / Share visible during 503 — clicks do not open menus</w:t>
+        <w:t>Figure 7. File / Import / Share visible during 503 — clicks do not open menus</w:t>
       </w:r>
     </w:p>
     <w:p/>
@@ -3606,7 +3827,7 @@
         <w:rPr>
           <w:color w:val="1B3A5F"/>
         </w:rPr>
-        <w:t>BUG-05  ·  My Files empty despite 26 documents from the API</w:t>
+        <w:t>BUG-06  ·  My Files click selects checkbox but does not open editor</w:t>
       </w:r>
     </w:p>
     <w:tbl>
@@ -3684,7 +3905,7 @@
                 <w:b w:val="0"/>
                 <w:sz w:val="20"/>
               </w:rPr>
-              <w:t>New this afternoon pass</w:t>
+              <w:t>New this pass</w:t>
             </w:r>
           </w:p>
         </w:tc>
@@ -3765,7 +3986,7 @@
       <w:r>
         <w:t>Description</w:t>
         <w:br/>
-        <w:t>GET https://api.rnd.legalassistant.au/documents returns 26 items for this account (6 DOCX, 3 PDF, 1 TXT, media, untitled). The My Files tab still shows an empty onboarding state: “+ New Folder” and “Let’s create new folder to get started”. Shared shows “No folders or documents have been shared with you yet”. Deep links to /d/{id} still resolve titles for some files, so the documents exist. The explorer is hiding them. Users cannot pick a file from the dashboard to open the editor.</w:t>
+        <w:t>My Files correctly listed documents on this pass (Dashboard folder with Untitled (10).docx, Report.pdf, etc.). Clicking the document name Untitled (10).docx only checked the selection checkbox. The URL stayed on the dashboard (/). The editor never opened. Users who do not know the /d/{id} deep link cannot open documents from the UI.</w:t>
       </w:r>
     </w:p>
     <w:p>
@@ -3780,22 +4001,17 @@
     </w:p>
     <w:p>
       <w:r>
-        <w:t>1.  Log in and wait for the dashboard.</w:t>
+        <w:t>1.  Log in and open My Files. Wait until the file list appears.</w:t>
       </w:r>
     </w:p>
     <w:p>
       <w:r>
-        <w:t>2.  Click My Files. Wait at least 8 seconds.</w:t>
+        <w:t>2.  Click Untitled (10).docx (the name, not only the checkbox).</w:t>
       </w:r>
     </w:p>
     <w:p>
       <w:r>
-        <w:t>3.  Click Shared.</w:t>
-      </w:r>
-    </w:p>
-    <w:p>
-      <w:r>
-        <w:t>4.  Compare with GET /documents using the logged-in access token.</w:t>
+        <w:t>3.  Observe whether the app navigates to /d/{id} and loads the editor.</w:t>
       </w:r>
     </w:p>
     <w:p>
@@ -3810,7 +4026,7 @@
     </w:p>
     <w:p>
       <w:r>
-        <w:t>My Files: empty create-folder state. Shared: nothing shared. API: 26 documents. Direct /d/{id} URLs still open (then fail in the editor).</w:t>
+        <w:t>File is selected (checkbox). URL remains https://app.rnd.legalassistant.au/. Editor does not open.</w:t>
       </w:r>
     </w:p>
     <w:p>
@@ -3825,9 +4041,72 @@
     </w:p>
     <w:p>
       <w:r>
-        <w:t>My Files lists the account’s documents and folders. Empty state is only for truly empty accounts.</w:t>
+        <w:t>Clicking a document opens it in the editor (navigate to /d/{id}). Selection for Amelia can remain a separate checkbox action.</w:t>
       </w:r>
     </w:p>
+    <w:p>
+      <w:r>
+        <w:rPr>
+          <w:b/>
+          <w:color w:val="1B3A5F"/>
+          <w:sz w:val="24"/>
+        </w:rPr>
+        <w:t>Screenshot</w:t>
+      </w:r>
+    </w:p>
+    <w:p>
+      <w:pPr>
+        <w:jc w:val="center"/>
+      </w:pPr>
+      <w:r>
+        <w:drawing>
+          <wp:inline xmlns:a="http://schemas.openxmlformats.org/drawingml/2006/main" xmlns:pic="http://schemas.openxmlformats.org/drawingml/2006/picture">
+            <wp:extent cx="5760720" cy="3600450"/>
+            <wp:docPr id="8" name="Picture 8"/>
+            <wp:cNvGraphicFramePr>
+              <a:graphicFrameLocks noChangeAspect="1"/>
+            </wp:cNvGraphicFramePr>
+            <a:graphic>
+              <a:graphicData uri="http://schemas.openxmlformats.org/drawingml/2006/picture">
+                <pic:pic>
+                  <pic:nvPicPr>
+                    <pic:cNvPr id="0" name="files.png"/>
+                    <pic:cNvPicPr/>
+                  </pic:nvPicPr>
+                  <pic:blipFill>
+                    <a:blip r:embed="rId15"/>
+                    <a:stretch>
+                      <a:fillRect/>
+                    </a:stretch>
+                  </pic:blipFill>
+                  <pic:spPr>
+                    <a:xfrm>
+                      <a:off x="0" y="0"/>
+                      <a:ext cx="5760720" cy="3600450"/>
+                    </a:xfrm>
+                    <a:prstGeom prst="rect"/>
+                  </pic:spPr>
+                </pic:pic>
+              </a:graphicData>
+            </a:graphic>
+          </wp:inline>
+        </w:drawing>
+      </w:r>
+    </w:p>
+    <w:p>
+      <w:pPr>
+        <w:jc w:val="center"/>
+      </w:pPr>
+      <w:r>
+        <w:rPr>
+          <w:i/>
+          <w:color w:val="4A5568"/>
+          <w:sz w:val="18"/>
+        </w:rPr>
+        <w:t>Figure 8. My Files — documents listed under Dashboard</w:t>
+      </w:r>
+    </w:p>
+    <w:p/>
     <w:p>
       <w:r>
         <w:rPr>
@@ -3854,7 +4133,7 @@
               <a:graphicData uri="http://schemas.openxmlformats.org/drawingml/2006/picture">
                 <pic:pic>
                   <pic:nvPicPr>
-                    <pic:cNvPr id="0" name="files.png"/>
+                    <pic:cNvPr id="0" name="from_list.png"/>
                     <pic:cNvPicPr/>
                   </pic:nvPicPr>
                   <pic:blipFill>
@@ -3887,70 +4166,7 @@
           <w:color w:val="4A5568"/>
           <w:sz w:val="18"/>
         </w:rPr>
-        <w:t>Figure 9. My Files — empty “create new folder” state</w:t>
-      </w:r>
-    </w:p>
-    <w:p/>
-    <w:p>
-      <w:r>
-        <w:rPr>
-          <w:b/>
-          <w:color w:val="1B3A5F"/>
-          <w:sz w:val="24"/>
-        </w:rPr>
-        <w:t>Screenshot</w:t>
-      </w:r>
-    </w:p>
-    <w:p>
-      <w:pPr>
-        <w:jc w:val="center"/>
-      </w:pPr>
-      <w:r>
-        <w:drawing>
-          <wp:inline xmlns:a="http://schemas.openxmlformats.org/drawingml/2006/main" xmlns:pic="http://schemas.openxmlformats.org/drawingml/2006/picture">
-            <wp:extent cx="5760720" cy="3600450"/>
-            <wp:docPr id="10" name="Picture 10"/>
-            <wp:cNvGraphicFramePr>
-              <a:graphicFrameLocks noChangeAspect="1"/>
-            </wp:cNvGraphicFramePr>
-            <a:graphic>
-              <a:graphicData uri="http://schemas.openxmlformats.org/drawingml/2006/picture">
-                <pic:pic>
-                  <pic:nvPicPr>
-                    <pic:cNvPr id="0" name="shared.png"/>
-                    <pic:cNvPicPr/>
-                  </pic:nvPicPr>
-                  <pic:blipFill>
-                    <a:blip r:embed="rId17"/>
-                    <a:stretch>
-                      <a:fillRect/>
-                    </a:stretch>
-                  </pic:blipFill>
-                  <pic:spPr>
-                    <a:xfrm>
-                      <a:off x="0" y="0"/>
-                      <a:ext cx="5760720" cy="3600450"/>
-                    </a:xfrm>
-                    <a:prstGeom prst="rect"/>
-                  </pic:spPr>
-                </pic:pic>
-              </a:graphicData>
-            </a:graphic>
-          </wp:inline>
-        </w:drawing>
-      </w:r>
-    </w:p>
-    <w:p>
-      <w:pPr>
-        <w:jc w:val="center"/>
-      </w:pPr>
-      <w:r>
-        <w:rPr>
-          <w:i/>
-          <w:color w:val="4A5568"/>
-          <w:sz w:val="18"/>
-        </w:rPr>
-        <w:t>Figure 10. Shared — no documents, so Import is not available here either</w:t>
+        <w:t>Figure 9. After clicking Untitled (10).docx — still on dashboard, file checked, editor not opened</w:t>
       </w:r>
     </w:p>
     <w:p/>
@@ -3962,7 +4178,7 @@
         <w:rPr>
           <w:color w:val="1B3A5F"/>
         </w:rPr>
-        <w:t>BUG-06  ·  Missing document: long spinner, then title “undefined | Quillio”</w:t>
+        <w:t>BUG-07  ·  Missing document: long spinner; title “undefined | Quillio”</w:t>
       </w:r>
     </w:p>
     <w:tbl>
@@ -4121,7 +4337,7 @@
       <w:r>
         <w:t>Description</w:t>
         <w:br/>
-        <w:t>Opening /d/000000000000000000000000 is a spinner at 16 seconds. At ~25 seconds the canvas correctly shows Unable to Load Document / This document could not be found with Try Again and Go to Dashboard. The browser tab title is “undefined | Quillio”.</w:t>
+        <w:t>Opening /d/000000000000000000000000 is a full-page spinner at 25 seconds. At ~35 seconds the canvas correctly shows Unable to Load Document / This document could not be found with Try Again and Go to Dashboard. The browser tab title is “undefined | Quillio”.</w:t>
       </w:r>
     </w:p>
     <w:p>
@@ -4136,12 +4352,12 @@
     </w:p>
     <w:p>
       <w:r>
-        <w:t>1.  While logged in, open /d/000000000000000000000000.</w:t>
+        <w:t>1.  Open /d/000000000000000000000000 while logged in.</w:t>
       </w:r>
     </w:p>
     <w:p>
       <w:r>
-        <w:t>2.  Observe the canvas at 16 seconds and at 25 seconds.</w:t>
+        <w:t>2.  Observe the canvas at 25s and at 35s.</w:t>
       </w:r>
     </w:p>
     <w:p>
@@ -4161,7 +4377,7 @@
     </w:p>
     <w:p>
       <w:r>
-        <w:t>16s: spinner. 25s: correct not-found empty state. Tab title: undefined | Quillio.</w:t>
+        <w:t>25s: spinner. 35s: correct not-found empty state. Tab title: undefined | Quillio.</w:t>
       </w:r>
     </w:p>
     <w:p>
@@ -4176,9 +4392,72 @@
     </w:p>
     <w:p>
       <w:r>
-        <w:t>Not-found should appear within a few seconds. Tab title should be Document not found | Quillio, never the string undefined.</w:t>
+        <w:t>Not-found should appear within a few seconds. Tab title should never be the string undefined.</w:t>
       </w:r>
     </w:p>
+    <w:p>
+      <w:r>
+        <w:rPr>
+          <w:b/>
+          <w:color w:val="1B3A5F"/>
+          <w:sz w:val="24"/>
+        </w:rPr>
+        <w:t>Screenshot</w:t>
+      </w:r>
+    </w:p>
+    <w:p>
+      <w:pPr>
+        <w:jc w:val="center"/>
+      </w:pPr>
+      <w:r>
+        <w:drawing>
+          <wp:inline xmlns:a="http://schemas.openxmlformats.org/drawingml/2006/main" xmlns:pic="http://schemas.openxmlformats.org/drawingml/2006/picture">
+            <wp:extent cx="5760720" cy="3600450"/>
+            <wp:docPr id="10" name="Picture 10"/>
+            <wp:cNvGraphicFramePr>
+              <a:graphicFrameLocks noChangeAspect="1"/>
+            </wp:cNvGraphicFramePr>
+            <a:graphic>
+              <a:graphicData uri="http://schemas.openxmlformats.org/drawingml/2006/picture">
+                <pic:pic>
+                  <pic:nvPicPr>
+                    <pic:cNvPr id="0" name="invalid25.png"/>
+                    <pic:cNvPicPr/>
+                  </pic:nvPicPr>
+                  <pic:blipFill>
+                    <a:blip r:embed="rId17"/>
+                    <a:stretch>
+                      <a:fillRect/>
+                    </a:stretch>
+                  </pic:blipFill>
+                  <pic:spPr>
+                    <a:xfrm>
+                      <a:off x="0" y="0"/>
+                      <a:ext cx="5760720" cy="3600450"/>
+                    </a:xfrm>
+                    <a:prstGeom prst="rect"/>
+                  </pic:spPr>
+                </pic:pic>
+              </a:graphicData>
+            </a:graphic>
+          </wp:inline>
+        </w:drawing>
+      </w:r>
+    </w:p>
+    <w:p>
+      <w:pPr>
+        <w:jc w:val="center"/>
+      </w:pPr>
+      <w:r>
+        <w:rPr>
+          <w:i/>
+          <w:color w:val="4A5568"/>
+          <w:sz w:val="18"/>
+        </w:rPr>
+        <w:t>Figure 10. Invalid id at 25 seconds — still spinning</w:t>
+      </w:r>
+    </w:p>
+    <w:p/>
     <w:p>
       <w:r>
         <w:rPr>
@@ -4205,7 +4484,7 @@
               <a:graphicData uri="http://schemas.openxmlformats.org/drawingml/2006/picture">
                 <pic:pic>
                   <pic:nvPicPr>
-                    <pic:cNvPr id="0" name="invalid16.png"/>
+                    <pic:cNvPr id="0" name="invalid35.png"/>
                     <pic:cNvPicPr/>
                   </pic:nvPicPr>
                   <pic:blipFill>
@@ -4238,70 +4517,7 @@
           <w:color w:val="4A5568"/>
           <w:sz w:val="18"/>
         </w:rPr>
-        <w:t>Figure 11. Invalid id at 16 seconds — still spinning</w:t>
-      </w:r>
-    </w:p>
-    <w:p/>
-    <w:p>
-      <w:r>
-        <w:rPr>
-          <w:b/>
-          <w:color w:val="1B3A5F"/>
-          <w:sz w:val="24"/>
-        </w:rPr>
-        <w:t>Screenshot</w:t>
-      </w:r>
-    </w:p>
-    <w:p>
-      <w:pPr>
-        <w:jc w:val="center"/>
-      </w:pPr>
-      <w:r>
-        <w:drawing>
-          <wp:inline xmlns:a="http://schemas.openxmlformats.org/drawingml/2006/main" xmlns:pic="http://schemas.openxmlformats.org/drawingml/2006/picture">
-            <wp:extent cx="5760720" cy="3600450"/>
-            <wp:docPr id="12" name="Picture 12"/>
-            <wp:cNvGraphicFramePr>
-              <a:graphicFrameLocks noChangeAspect="1"/>
-            </wp:cNvGraphicFramePr>
-            <a:graphic>
-              <a:graphicData uri="http://schemas.openxmlformats.org/drawingml/2006/picture">
-                <pic:pic>
-                  <pic:nvPicPr>
-                    <pic:cNvPr id="0" name="invalid25.png"/>
-                    <pic:cNvPicPr/>
-                  </pic:nvPicPr>
-                  <pic:blipFill>
-                    <a:blip r:embed="rId19"/>
-                    <a:stretch>
-                      <a:fillRect/>
-                    </a:stretch>
-                  </pic:blipFill>
-                  <pic:spPr>
-                    <a:xfrm>
-                      <a:off x="0" y="0"/>
-                      <a:ext cx="5760720" cy="3600450"/>
-                    </a:xfrm>
-                    <a:prstGeom prst="rect"/>
-                  </pic:spPr>
-                </pic:pic>
-              </a:graphicData>
-            </a:graphic>
-          </wp:inline>
-        </w:drawing>
-      </w:r>
-    </w:p>
-    <w:p>
-      <w:pPr>
-        <w:jc w:val="center"/>
-      </w:pPr>
-      <w:r>
-        <w:rPr>
-          <w:i/>
-          <w:color w:val="4A5568"/>
-          <w:sz w:val="18"/>
-        </w:rPr>
-        <w:t>Figure 12. Invalid id at 25 seconds — correct empty state (tab title remains undefined | Quillio)</w:t>
+        <w:t>Figure 11. Invalid id at 35 seconds — correct empty state (tab title remains undefined | Quillio)</w:t>
       </w:r>
     </w:p>
     <w:p/>
@@ -4313,7 +4529,7 @@
         <w:rPr>
           <w:color w:val="1B3A5F"/>
         </w:rPr>
-        <w:t>BUG-07  ·  Login URL without slash redirects HTTPS → HTTP</w:t>
+        <w:t>BUG-08  ·  Login URL without slash redirects HTTPS → HTTP</w:t>
       </w:r>
     </w:p>
     <w:tbl>
@@ -4472,7 +4688,7 @@
       <w:r>
         <w:t>Description</w:t>
         <w:br/>
-        <w:t>GET https://app.rnd.legalassistant.au/auth/login (no trailing slash) returns HTTP 301 Location: http://app.rnd.legalassistant.au/auth/login/ (scheme downgraded). Chromium can fail that hop with net::ERR_CONNECTION_RESET. The slash URL returns 200. Confirmed again this afternoon with curl.</w:t>
+        <w:t>GET https://app.rnd.legalassistant.au/auth/login (no trailing slash) returns HTTP 301 Location: http://app.rnd.legalassistant.au/auth/login/ (scheme downgraded). Confirmed again this pass with curl. The slash URL returns 200. Chromium can fail the HTTP hop with net::ERR_CONNECTION_RESET.</w:t>
       </w:r>
     </w:p>
     <w:p>
@@ -4507,7 +4723,7 @@
     </w:p>
     <w:p>
       <w:r>
-        <w:t>No-slash URL 301s to an http:// Location (curl 18 Aug 14:17 UTC).</w:t>
+        <w:t>No-slash URL 301s to an http:// Location.</w:t>
       </w:r>
     </w:p>
     <w:p>
@@ -4533,7 +4749,7 @@
         <w:rPr>
           <w:color w:val="1B3A5F"/>
         </w:rPr>
-        <w:t>BUG-08  ·  Home first paint stuck on “Loading files…”</w:t>
+        <w:t>BUG-09  ·  Home first paint shows “Loading files…”</w:t>
       </w:r>
     </w:p>
     <w:tbl>
@@ -4692,7 +4908,7 @@
       <w:r>
         <w:t>Description</w:t>
         <w:br/>
-        <w:t>Immediately after login, My Files shows a spinner and “Loading files…”. On this pass the list never populated; it flipped to the empty create-folder state (BUG-05). First paint looks broken either way.</w:t>
+        <w:t>Immediately after login, My Files shows Loading files…. On this pass the list did populate after several seconds. First paint still looks broken and can confuse users.</w:t>
       </w:r>
     </w:p>
     <w:p>
@@ -4707,12 +4923,7 @@
     </w:p>
     <w:p>
       <w:r>
-        <w:t>1.  Log in and stay on the home dashboard without waiting.</w:t>
-      </w:r>
-    </w:p>
-    <w:p>
-      <w:r>
-        <w:t>2.  Look at My Files.</w:t>
+        <w:t>1.  Log in and look at My Files without waiting.</w:t>
       </w:r>
     </w:p>
     <w:p>
@@ -4727,7 +4938,7 @@
     </w:p>
     <w:p>
       <w:r>
-        <w:t>My Files shows Loading files… on first paint, then an empty folder prompt — not the 26 API documents.</w:t>
+        <w:t>First paint: Loading files…. List appears later.</w:t>
       </w:r>
     </w:p>
     <w:p>
@@ -4742,7 +4953,102 @@
     </w:p>
     <w:p>
       <w:r>
-        <w:t>The file list should render quickly, or show a timeout/retry, and must match the documents that exist for the account.</w:t>
+        <w:t>File list should render quickly or show a skeleton with a clear timeout.</w:t>
+      </w:r>
+    </w:p>
+    <w:p>
+      <w:r>
+        <w:rPr>
+          <w:b/>
+          <w:color w:val="1B3A5F"/>
+          <w:sz w:val="24"/>
+        </w:rPr>
+        <w:t>Screenshot</w:t>
+      </w:r>
+    </w:p>
+    <w:p>
+      <w:pPr>
+        <w:jc w:val="center"/>
+      </w:pPr>
+      <w:r>
+        <w:drawing>
+          <wp:inline xmlns:a="http://schemas.openxmlformats.org/drawingml/2006/main" xmlns:pic="http://schemas.openxmlformats.org/drawingml/2006/picture">
+            <wp:extent cx="5760720" cy="3600450"/>
+            <wp:docPr id="12" name="Picture 12"/>
+            <wp:cNvGraphicFramePr>
+              <a:graphicFrameLocks noChangeAspect="1"/>
+            </wp:cNvGraphicFramePr>
+            <a:graphic>
+              <a:graphicData uri="http://schemas.openxmlformats.org/drawingml/2006/picture">
+                <pic:pic>
+                  <pic:nvPicPr>
+                    <pic:cNvPr id="0" name="home.png"/>
+                    <pic:cNvPicPr/>
+                  </pic:nvPicPr>
+                  <pic:blipFill>
+                    <a:blip r:embed="rId19"/>
+                    <a:stretch>
+                      <a:fillRect/>
+                    </a:stretch>
+                  </pic:blipFill>
+                  <pic:spPr>
+                    <a:xfrm>
+                      <a:off x="0" y="0"/>
+                      <a:ext cx="5760720" cy="3600450"/>
+                    </a:xfrm>
+                    <a:prstGeom prst="rect"/>
+                  </pic:spPr>
+                </pic:pic>
+              </a:graphicData>
+            </a:graphic>
+          </wp:inline>
+        </w:drawing>
+      </w:r>
+    </w:p>
+    <w:p>
+      <w:pPr>
+        <w:jc w:val="center"/>
+      </w:pPr>
+      <w:r>
+        <w:rPr>
+          <w:i/>
+          <w:color w:val="4A5568"/>
+          <w:sz w:val="18"/>
+        </w:rPr>
+        <w:t>Figure 12. Home immediately after login — Loading files…</w:t>
+      </w:r>
+    </w:p>
+    <w:p/>
+    <w:p>
+      <w:pPr>
+        <w:pStyle w:val="Heading1"/>
+      </w:pPr>
+      <w:r>
+        <w:rPr>
+          <w:color w:val="1B3A5F"/>
+        </w:rPr>
+        <w:t>6. Prior format bugs (17 August) — blocked, not retested</w:t>
+      </w:r>
+    </w:p>
+    <w:p>
+      <w:r>
+        <w:t>These were still failing on 17 August when the OnlyOffice iframe loaded. This pass the native SDK is the default and no canvas showed document content, so they remain open.</w:t>
+      </w:r>
+    </w:p>
+    <w:p>
+      <w:pPr>
+        <w:pStyle w:val="Heading2"/>
+      </w:pPr>
+      <w:r>
+        <w:rPr>
+          <w:color w:val="1B3A5F"/>
+        </w:rPr>
+        <w:t>H-01  Legacy / large DOC cannot be upgraded</w:t>
+      </w:r>
+    </w:p>
+    <w:p>
+      <w:r>
+        <w:t>1-MB-DOC.doc: could not be upgraded. Retry became permanent. Header Not saved.</w:t>
       </w:r>
     </w:p>
     <w:p>
@@ -4771,106 +5077,11 @@
               <a:graphicData uri="http://schemas.openxmlformats.org/drawingml/2006/picture">
                 <pic:pic>
                   <pic:nvPicPr>
-                    <pic:cNvPr id="0" name="home.png"/>
+                    <pic:cNvPr id="0" name="h_doc.png"/>
                     <pic:cNvPicPr/>
                   </pic:nvPicPr>
                   <pic:blipFill>
                     <a:blip r:embed="rId20"/>
-                    <a:stretch>
-                      <a:fillRect/>
-                    </a:stretch>
-                  </pic:blipFill>
-                  <pic:spPr>
-                    <a:xfrm>
-                      <a:off x="0" y="0"/>
-                      <a:ext cx="5760720" cy="3600450"/>
-                    </a:xfrm>
-                    <a:prstGeom prst="rect"/>
-                  </pic:spPr>
-                </pic:pic>
-              </a:graphicData>
-            </a:graphic>
-          </wp:inline>
-        </w:drawing>
-      </w:r>
-    </w:p>
-    <w:p>
-      <w:pPr>
-        <w:jc w:val="center"/>
-      </w:pPr>
-      <w:r>
-        <w:rPr>
-          <w:i/>
-          <w:color w:val="4A5568"/>
-          <w:sz w:val="18"/>
-        </w:rPr>
-        <w:t>Figure 13. Home immediately after login — Loading files…</w:t>
-      </w:r>
-    </w:p>
-    <w:p/>
-    <w:p>
-      <w:pPr>
-        <w:pStyle w:val="Heading1"/>
-      </w:pPr>
-      <w:r>
-        <w:rPr>
-          <w:color w:val="1B3A5F"/>
-        </w:rPr>
-        <w:t>6. Prior format bugs (17 August) — blocked, not retested</w:t>
-      </w:r>
-    </w:p>
-    <w:p>
-      <w:r>
-        <w:t>These were still failing on 17 August when the OnlyOffice iframe loaded. This afternoon the native SDK is the default and no canvas showed document content, so they remain open. Screenshots below are from the 17 August report.</w:t>
-      </w:r>
-    </w:p>
-    <w:p>
-      <w:pPr>
-        <w:pStyle w:val="Heading2"/>
-      </w:pPr>
-      <w:r>
-        <w:rPr>
-          <w:color w:val="1B3A5F"/>
-        </w:rPr>
-        <w:t>H-01  Legacy / large DOC cannot be upgraded</w:t>
-      </w:r>
-    </w:p>
-    <w:p>
-      <w:r>
-        <w:t>1-MB-DOC.doc: could not be upgraded for the editor. Retry became permanent. Header Not saved.</w:t>
-      </w:r>
-    </w:p>
-    <w:p>
-      <w:r>
-        <w:rPr>
-          <w:b/>
-          <w:color w:val="1B3A5F"/>
-          <w:sz w:val="24"/>
-        </w:rPr>
-        <w:t>Screenshot</w:t>
-      </w:r>
-    </w:p>
-    <w:p>
-      <w:pPr>
-        <w:jc w:val="center"/>
-      </w:pPr>
-      <w:r>
-        <w:drawing>
-          <wp:inline xmlns:a="http://schemas.openxmlformats.org/drawingml/2006/main" xmlns:pic="http://schemas.openxmlformats.org/drawingml/2006/picture">
-            <wp:extent cx="5760720" cy="3600450"/>
-            <wp:docPr id="14" name="Picture 14"/>
-            <wp:cNvGraphicFramePr>
-              <a:graphicFrameLocks noChangeAspect="1"/>
-            </wp:cNvGraphicFramePr>
-            <a:graphic>
-              <a:graphicData uri="http://schemas.openxmlformats.org/drawingml/2006/picture">
-                <pic:pic>
-                  <pic:nvPicPr>
-                    <pic:cNvPr id="0" name="h_doc.png"/>
-                    <pic:cNvPicPr/>
-                  </pic:nvPicPr>
-                  <pic:blipFill>
-                    <a:blip r:embed="rId21"/>
                     <a:stretch>
                       <a:fillRect/>
                     </a:stretch>
@@ -4937,7 +5148,7 @@
         <w:drawing>
           <wp:inline xmlns:a="http://schemas.openxmlformats.org/drawingml/2006/main" xmlns:pic="http://schemas.openxmlformats.org/drawingml/2006/picture">
             <wp:extent cx="5760720" cy="3600450"/>
-            <wp:docPr id="15" name="Picture 15"/>
+            <wp:docPr id="14" name="Picture 14"/>
             <wp:cNvGraphicFramePr>
               <a:graphicFrameLocks noChangeAspect="1"/>
             </wp:cNvGraphicFramePr>
@@ -4949,7 +5160,7 @@
                     <pic:cNvPicPr/>
                   </pic:nvPicPr>
                   <pic:blipFill>
-                    <a:blip r:embed="rId22"/>
+                    <a:blip r:embed="rId21"/>
                     <a:stretch>
                       <a:fillRect/>
                     </a:stretch>
@@ -5016,7 +5227,7 @@
         <w:drawing>
           <wp:inline xmlns:a="http://schemas.openxmlformats.org/drawingml/2006/main" xmlns:pic="http://schemas.openxmlformats.org/drawingml/2006/picture">
             <wp:extent cx="5760720" cy="3600450"/>
-            <wp:docPr id="16" name="Picture 16"/>
+            <wp:docPr id="15" name="Picture 15"/>
             <wp:cNvGraphicFramePr>
               <a:graphicFrameLocks noChangeAspect="1"/>
             </wp:cNvGraphicFramePr>
@@ -5028,7 +5239,7 @@
                     <pic:cNvPicPr/>
                   </pic:nvPicPr>
                   <pic:blipFill>
-                    <a:blip r:embed="rId23"/>
+                    <a:blip r:embed="rId22"/>
                     <a:stretch>
                       <a:fillRect/>
                     </a:stretch>
@@ -5095,7 +5306,7 @@
         <w:drawing>
           <wp:inline xmlns:a="http://schemas.openxmlformats.org/drawingml/2006/main" xmlns:pic="http://schemas.openxmlformats.org/drawingml/2006/picture">
             <wp:extent cx="5760720" cy="3600450"/>
-            <wp:docPr id="17" name="Picture 17"/>
+            <wp:docPr id="16" name="Picture 16"/>
             <wp:cNvGraphicFramePr>
               <a:graphicFrameLocks noChangeAspect="1"/>
             </wp:cNvGraphicFramePr>
@@ -5107,7 +5318,7 @@
                     <pic:cNvPicPr/>
                   </pic:nvPicPr>
                   <pic:blipFill>
-                    <a:blip r:embed="rId24"/>
+                    <a:blip r:embed="rId23"/>
                     <a:stretch>
                       <a:fillRect/>
                     </a:stretch>
@@ -5174,7 +5385,7 @@
         <w:drawing>
           <wp:inline xmlns:a="http://schemas.openxmlformats.org/drawingml/2006/main" xmlns:pic="http://schemas.openxmlformats.org/drawingml/2006/picture">
             <wp:extent cx="5760720" cy="3600450"/>
-            <wp:docPr id="18" name="Picture 18"/>
+            <wp:docPr id="17" name="Picture 17"/>
             <wp:cNvGraphicFramePr>
               <a:graphicFrameLocks noChangeAspect="1"/>
             </wp:cNvGraphicFramePr>
@@ -5186,7 +5397,7 @@
                     <pic:cNvPicPr/>
                   </pic:nvPicPr>
                   <pic:blipFill>
-                    <a:blip r:embed="rId25"/>
+                    <a:blip r:embed="rId24"/>
                     <a:stretch>
                       <a:fillRect/>
                     </a:stretch>
@@ -5253,7 +5464,7 @@
         <w:drawing>
           <wp:inline xmlns:a="http://schemas.openxmlformats.org/drawingml/2006/main" xmlns:pic="http://schemas.openxmlformats.org/drawingml/2006/picture">
             <wp:extent cx="5760720" cy="3600450"/>
-            <wp:docPr id="19" name="Picture 19"/>
+            <wp:docPr id="18" name="Picture 18"/>
             <wp:cNvGraphicFramePr>
               <a:graphicFrameLocks noChangeAspect="1"/>
             </wp:cNvGraphicFramePr>
@@ -5265,7 +5476,7 @@
                     <pic:cNvPicPr/>
                   </pic:nvPicPr>
                   <pic:blipFill>
-                    <a:blip r:embed="rId26"/>
+                    <a:blip r:embed="rId25"/>
                     <a:stretch>
                       <a:fillRect/>
                     </a:stretch>
@@ -5330,7 +5541,7 @@
         <w:pStyle w:val="ListBullet"/>
       </w:pPr>
       <w:r>
-        <w:t>GET /documents with the access token returns 26 files (explorer just does not show them).</w:t>
+        <w:t>GET /documents returns 26 files; My Files listed them on this pass.</w:t>
       </w:r>
     </w:p>
     <w:p>
@@ -5338,7 +5549,7 @@
         <w:pStyle w:val="ListBullet"/>
       </w:pPr>
       <w:r>
-        <w:t>Invalid id eventually shows Unable to Load Document with Try Again and Go to Dashboard (after a long spinner).</w:t>
+        <w:t>Invalid id eventually shows Unable to Load Document (after a long spinner).</w:t>
       </w:r>
     </w:p>
     <w:p>
@@ -5346,7 +5557,7 @@
         <w:pStyle w:val="ListBullet"/>
       </w:pPr>
       <w:r>
-        <w:t>Some document titles still resolve in the editor header (CSV, XLSX, PDF) before the 503.</w:t>
+        <w:t>Some document titles resolve in the editor header (CSV, XLSX, PDF) before failure.</w:t>
       </w:r>
     </w:p>
     <w:p>
@@ -5357,7 +5568,7 @@
         <w:rPr>
           <w:color w:val="1B3A5F"/>
         </w:rPr>
-        <w:t>8. Recommended next checks (after session 503 is fixed)</w:t>
+        <w:t>8. Recommended next checks (after session/timeout is fixed)</w:t>
       </w:r>
     </w:p>
     <w:p>
@@ -5365,7 +5576,7 @@
         <w:pStyle w:val="ListBullet"/>
       </w:pPr>
       <w:r>
-        <w:t>Retest BUG-01 to BUG-04: session 200, every format opens, spinner times out, File/Import/Share clickable.</w:t>
+        <w:t>Retest BUG-01–BUG-05: session 200, formats open, File/Import/Share clickable, consistent errors.</w:t>
       </w:r>
     </w:p>
     <w:p>
@@ -5373,7 +5584,7 @@
         <w:pStyle w:val="ListBullet"/>
       </w:pPr>
       <w:r>
-        <w:t>Fix My Files vs /documents mismatch (BUG-05) so testers can open files from the dashboard.</w:t>
+        <w:t>Fix My Files open-on-click (BUG-06) so dashboard navigation reaches the editor.</w:t>
       </w:r>
     </w:p>
     <w:p>

</xml_diff>